<commit_message>
Add 10 informative figures (flowcharts, framework diagrams, charts)
Embedded figures with bold-italic captions in their respective sections:
- Fig 3.1  Overall research process flowchart
- Fig 3.2  Malta supply-chain stakeholder map
- Fig 3.3  RBV framework diagram
- Fig 3.4  Three-phase data-collection timeline (Gantt)
- Fig 3.5  Sources converging into 144-factor pool
- Fig 3.6  Stage x Dimension factor distribution (initial vs final)
- Fig 3.7  Three-step refinement funnel (144 -> 116 -> 94 -> 82)
- Fig 3.8  Cronbach's alpha across 15 sub-scales
- Fig 3.9  Stratified sampling tree (n = 1,300)
- Fig 3.10 Two-stage MCDM pipeline (Fuzzy AHP + ELECTRE)

Updated Section 3.13 to reference all figures explicitly. Document now
contains 4 tables and 10 embedded PNG figures. Reliability data in
Fig 3.8 sourced directly from Malta_.xlsx Reliability_Report sheet.
</commit_message>
<xml_diff>
--- a/Chapter_3_Research_Methodology.docx
+++ b/Chapter_3_Research_Methodology.docx
@@ -66,6 +66,61 @@
     </w:p>
     <w:p>
       <w:pPr>
+        <w:spacing w:before="160" w:after="40"/>
+        <w:jc w:val="center"/>
+      </w:pPr>
+      <w:r>
+        <w:drawing>
+          <wp:inline xmlns:a="http://schemas.openxmlformats.org/drawingml/2006/main" xmlns:pic="http://schemas.openxmlformats.org/drawingml/2006/picture">
+            <wp:extent cx="5120640" cy="7258561"/>
+            <wp:docPr id="1" name="Picture 1"/>
+            <wp:cNvGraphicFramePr>
+              <a:graphicFrameLocks noChangeAspect="1"/>
+            </wp:cNvGraphicFramePr>
+            <a:graphic>
+              <a:graphicData uri="http://schemas.openxmlformats.org/drawingml/2006/picture">
+                <pic:pic>
+                  <pic:nvPicPr>
+                    <pic:cNvPr id="0" name="fig_3_1_research_process.png"/>
+                    <pic:cNvPicPr/>
+                  </pic:nvPicPr>
+                  <pic:blipFill>
+                    <a:blip r:embed="rId9"/>
+                    <a:stretch>
+                      <a:fillRect/>
+                    </a:stretch>
+                  </pic:blipFill>
+                  <pic:spPr>
+                    <a:xfrm>
+                      <a:off x="0" y="0"/>
+                      <a:ext cx="5120640" cy="7258561"/>
+                    </a:xfrm>
+                    <a:prstGeom prst="rect"/>
+                  </pic:spPr>
+                </pic:pic>
+              </a:graphicData>
+            </a:graphic>
+          </wp:inline>
+        </w:drawing>
+      </w:r>
+    </w:p>
+    <w:p>
+      <w:pPr>
+        <w:spacing w:before="40" w:after="160"/>
+        <w:jc w:val="center"/>
+      </w:pPr>
+      <w:r>
+        <w:rPr>
+          <w:rFonts w:ascii="Times New Roman" w:hAnsi="Times New Roman" w:cs="Times New Roman"/>
+          <w:b/>
+          <w:i/>
+          <w:sz w:val="22"/>
+        </w:rPr>
+        <w:t>Figure 3.1  Overall research process flowchart (problem identification through to optimisation framework)</w:t>
+      </w:r>
+    </w:p>
+    <w:p>
+      <w:pPr>
         <w:keepNext/>
         <w:spacing w:before="240" w:after="120"/>
         <w:jc w:val="left"/>
@@ -98,6 +153,61 @@
     </w:p>
     <w:p>
       <w:pPr>
+        <w:spacing w:before="160" w:after="40"/>
+        <w:jc w:val="center"/>
+      </w:pPr>
+      <w:r>
+        <w:drawing>
+          <wp:inline xmlns:a="http://schemas.openxmlformats.org/drawingml/2006/main" xmlns:pic="http://schemas.openxmlformats.org/drawingml/2006/picture">
+            <wp:extent cx="5852160" cy="2906792"/>
+            <wp:docPr id="2" name="Picture 2"/>
+            <wp:cNvGraphicFramePr>
+              <a:graphicFrameLocks noChangeAspect="1"/>
+            </wp:cNvGraphicFramePr>
+            <a:graphic>
+              <a:graphicData uri="http://schemas.openxmlformats.org/drawingml/2006/picture">
+                <pic:pic>
+                  <pic:nvPicPr>
+                    <pic:cNvPr id="0" name="fig_3_3_supply_chain.png"/>
+                    <pic:cNvPicPr/>
+                  </pic:nvPicPr>
+                  <pic:blipFill>
+                    <a:blip r:embed="rId10"/>
+                    <a:stretch>
+                      <a:fillRect/>
+                    </a:stretch>
+                  </pic:blipFill>
+                  <pic:spPr>
+                    <a:xfrm>
+                      <a:off x="0" y="0"/>
+                      <a:ext cx="5852160" cy="2906792"/>
+                    </a:xfrm>
+                    <a:prstGeom prst="rect"/>
+                  </pic:spPr>
+                </pic:pic>
+              </a:graphicData>
+            </a:graphic>
+          </wp:inline>
+        </w:drawing>
+      </w:r>
+    </w:p>
+    <w:p>
+      <w:pPr>
+        <w:spacing w:before="40" w:after="160"/>
+        <w:jc w:val="center"/>
+      </w:pPr>
+      <w:r>
+        <w:rPr>
+          <w:rFonts w:ascii="Times New Roman" w:hAnsi="Times New Roman" w:cs="Times New Roman"/>
+          <w:b/>
+          <w:i/>
+          <w:sz w:val="22"/>
+        </w:rPr>
+        <w:t>Figure 3.2  Malta (Citrus sinensis) supply-chain stakeholder map showing the five strata in which data was collected</w:t>
+      </w:r>
+    </w:p>
+    <w:p>
+      <w:pPr>
         <w:keepNext/>
         <w:spacing w:before="160" w:after="80"/>
       </w:pPr>
@@ -173,6 +283,61 @@
           <w:sz w:val="24"/>
         </w:rPr>
         <w:t>Viewing the chain through the RBV makes it possible to read the 144 initially identified factors and the 82 finally retained factors not as a loose list of operational issues but as proxies for the underlying resources and capabilities of the chain. Cost-related items signal financial and physical resources; time-related items signal coordination and process capabilities; and quality-related items signal knowledge, skill and infrastructural resources. The theoretical contribution of this study is therefore to map the operational constraints of a hill-based citrus chain on to the resource-and-capability vocabulary of the RBV, so that the eventual framework of optimisation does not stop at fixing surface-level problems but speaks directly to which resources of the chain need to be strengthened, shared or substituted.</w:t>
+      </w:r>
+    </w:p>
+    <w:p>
+      <w:pPr>
+        <w:spacing w:before="160" w:after="40"/>
+        <w:jc w:val="center"/>
+      </w:pPr>
+      <w:r>
+        <w:drawing>
+          <wp:inline xmlns:a="http://schemas.openxmlformats.org/drawingml/2006/main" xmlns:pic="http://schemas.openxmlformats.org/drawingml/2006/picture">
+            <wp:extent cx="5852160" cy="4190805"/>
+            <wp:docPr id="3" name="Picture 3"/>
+            <wp:cNvGraphicFramePr>
+              <a:graphicFrameLocks noChangeAspect="1"/>
+            </wp:cNvGraphicFramePr>
+            <a:graphic>
+              <a:graphicData uri="http://schemas.openxmlformats.org/drawingml/2006/picture">
+                <pic:pic>
+                  <pic:nvPicPr>
+                    <pic:cNvPr id="0" name="fig_3_4_rbv_framework.png"/>
+                    <pic:cNvPicPr/>
+                  </pic:nvPicPr>
+                  <pic:blipFill>
+                    <a:blip r:embed="rId11"/>
+                    <a:stretch>
+                      <a:fillRect/>
+                    </a:stretch>
+                  </pic:blipFill>
+                  <pic:spPr>
+                    <a:xfrm>
+                      <a:off x="0" y="0"/>
+                      <a:ext cx="5852160" cy="4190805"/>
+                    </a:xfrm>
+                    <a:prstGeom prst="rect"/>
+                  </pic:spPr>
+                </pic:pic>
+              </a:graphicData>
+            </a:graphic>
+          </wp:inline>
+        </w:drawing>
+      </w:r>
+    </w:p>
+    <w:p>
+      <w:pPr>
+        <w:spacing w:before="40" w:after="160"/>
+        <w:jc w:val="center"/>
+      </w:pPr>
+      <w:r>
+        <w:rPr>
+          <w:rFonts w:ascii="Times New Roman" w:hAnsi="Times New Roman" w:cs="Times New Roman"/>
+          <w:b/>
+          <w:i/>
+          <w:sz w:val="22"/>
+        </w:rPr>
+        <w:t>Figure 3.3  Resource-Based View (RBV) framework mapped to the cost / time / quality dimensions of the Malta supply chain</w:t>
       </w:r>
     </w:p>
     <w:p>
@@ -582,6 +747,61 @@
     </w:p>
     <w:p>
       <w:pPr>
+        <w:spacing w:before="160" w:after="40"/>
+        <w:jc w:val="center"/>
+      </w:pPr>
+      <w:r>
+        <w:drawing>
+          <wp:inline xmlns:a="http://schemas.openxmlformats.org/drawingml/2006/main" xmlns:pic="http://schemas.openxmlformats.org/drawingml/2006/picture">
+            <wp:extent cx="5852160" cy="2546704"/>
+            <wp:docPr id="4" name="Picture 4"/>
+            <wp:cNvGraphicFramePr>
+              <a:graphicFrameLocks noChangeAspect="1"/>
+            </wp:cNvGraphicFramePr>
+            <a:graphic>
+              <a:graphicData uri="http://schemas.openxmlformats.org/drawingml/2006/picture">
+                <pic:pic>
+                  <pic:nvPicPr>
+                    <pic:cNvPr id="0" name="fig_3_2_phases_timeline.png"/>
+                    <pic:cNvPicPr/>
+                  </pic:nvPicPr>
+                  <pic:blipFill>
+                    <a:blip r:embed="rId12"/>
+                    <a:stretch>
+                      <a:fillRect/>
+                    </a:stretch>
+                  </pic:blipFill>
+                  <pic:spPr>
+                    <a:xfrm>
+                      <a:off x="0" y="0"/>
+                      <a:ext cx="5852160" cy="2546704"/>
+                    </a:xfrm>
+                    <a:prstGeom prst="rect"/>
+                  </pic:spPr>
+                </pic:pic>
+              </a:graphicData>
+            </a:graphic>
+          </wp:inline>
+        </w:drawing>
+      </w:r>
+    </w:p>
+    <w:p>
+      <w:pPr>
+        <w:spacing w:before="40" w:after="160"/>
+        <w:jc w:val="center"/>
+      </w:pPr>
+      <w:r>
+        <w:rPr>
+          <w:rFonts w:ascii="Times New Roman" w:hAnsi="Times New Roman" w:cs="Times New Roman"/>
+          <w:b/>
+          <w:i/>
+          <w:sz w:val="22"/>
+        </w:rPr>
+        <w:t>Figure 3.4  Three-phase data-collection timeline (September 2024 – December 2025)</w:t>
+      </w:r>
+    </w:p>
+    <w:p>
+      <w:pPr>
         <w:spacing w:line="360" w:lineRule="auto" w:after="120"/>
         <w:ind w:firstLine="425"/>
         <w:jc w:val="both"/>
@@ -649,7 +869,6 @@
         <w:spacing w:after="40" w:line="276" w:lineRule="auto"/>
         <w:ind w:left="567"/>
       </w:pPr>
-      <w:r/>
       <w:r>
         <w:rPr>
           <w:rFonts w:ascii="Times New Roman" w:hAnsi="Times New Roman" w:cs="Times New Roman"/>
@@ -666,7 +885,6 @@
         <w:spacing w:after="40" w:line="276" w:lineRule="auto"/>
         <w:ind w:left="567"/>
       </w:pPr>
-      <w:r/>
       <w:r>
         <w:rPr>
           <w:rFonts w:ascii="Times New Roman" w:hAnsi="Times New Roman" w:cs="Times New Roman"/>
@@ -683,7 +901,6 @@
         <w:spacing w:after="40" w:line="276" w:lineRule="auto"/>
         <w:ind w:left="567"/>
       </w:pPr>
-      <w:r/>
       <w:r>
         <w:rPr>
           <w:rFonts w:ascii="Times New Roman" w:hAnsi="Times New Roman" w:cs="Times New Roman"/>
@@ -700,7 +917,6 @@
         <w:spacing w:after="40" w:line="276" w:lineRule="auto"/>
         <w:ind w:left="567"/>
       </w:pPr>
-      <w:r/>
       <w:r>
         <w:rPr>
           <w:rFonts w:ascii="Times New Roman" w:hAnsi="Times New Roman" w:cs="Times New Roman"/>
@@ -717,7 +933,6 @@
         <w:spacing w:after="40" w:line="276" w:lineRule="auto"/>
         <w:ind w:left="567"/>
       </w:pPr>
-      <w:r/>
       <w:r>
         <w:rPr>
           <w:rFonts w:ascii="Times New Roman" w:hAnsi="Times New Roman" w:cs="Times New Roman"/>
@@ -726,6 +941,61 @@
           <w:sz w:val="24"/>
         </w:rPr>
         <w:t>Direct field observations and walk-along observations from orchard to retail outlet, recorded in a structured field diary.</w:t>
+      </w:r>
+    </w:p>
+    <w:p>
+      <w:pPr>
+        <w:spacing w:before="160" w:after="40"/>
+        <w:jc w:val="center"/>
+      </w:pPr>
+      <w:r>
+        <w:drawing>
+          <wp:inline xmlns:a="http://schemas.openxmlformats.org/drawingml/2006/main" xmlns:pic="http://schemas.openxmlformats.org/drawingml/2006/picture">
+            <wp:extent cx="5852160" cy="3394696"/>
+            <wp:docPr id="5" name="Picture 5"/>
+            <wp:cNvGraphicFramePr>
+              <a:graphicFrameLocks noChangeAspect="1"/>
+            </wp:cNvGraphicFramePr>
+            <a:graphic>
+              <a:graphicData uri="http://schemas.openxmlformats.org/drawingml/2006/picture">
+                <pic:pic>
+                  <pic:nvPicPr>
+                    <pic:cNvPr id="0" name="fig_3_5_factor_sources.png"/>
+                    <pic:cNvPicPr/>
+                  </pic:nvPicPr>
+                  <pic:blipFill>
+                    <a:blip r:embed="rId13"/>
+                    <a:stretch>
+                      <a:fillRect/>
+                    </a:stretch>
+                  </pic:blipFill>
+                  <pic:spPr>
+                    <a:xfrm>
+                      <a:off x="0" y="0"/>
+                      <a:ext cx="5852160" cy="3394696"/>
+                    </a:xfrm>
+                    <a:prstGeom prst="rect"/>
+                  </pic:spPr>
+                </pic:pic>
+              </a:graphicData>
+            </a:graphic>
+          </wp:inline>
+        </w:drawing>
+      </w:r>
+    </w:p>
+    <w:p>
+      <w:pPr>
+        <w:spacing w:before="40" w:after="160"/>
+        <w:jc w:val="center"/>
+      </w:pPr>
+      <w:r>
+        <w:rPr>
+          <w:rFonts w:ascii="Times New Roman" w:hAnsi="Times New Roman" w:cs="Times New Roman"/>
+          <w:b/>
+          <w:i/>
+          <w:sz w:val="22"/>
+        </w:rPr>
+        <w:t>Figure 3.5  Five sources converging into the initial pool of 144 factors</w:t>
       </w:r>
     </w:p>
     <w:p>
@@ -756,7 +1026,7 @@
           <w:i w:val="0"/>
           <w:sz w:val="24"/>
         </w:rPr>
-        <w:t>The 144 factors were first organised on two intersecting axes: (a) the stage of the supply chain (Farm, Local Trader/Commission Agent, Mandi/Wholesale, Retail, Transportation) and (b) the dimension of inefficiency (Cost, Time, Quality). The stage-wise distribution of the initial pool is given in Table 3.2.</w:t>
+        <w:t>The 144 factors were first organised on two intersecting axes: (a) the stage of the supply chain (Farm, Local Trader/Commission Agent, Mandi/Wholesale, Retail, Transportation) and (b) the dimension of inefficiency (Cost, Time, Quality). The stage-wise distribution of the initial pool is given in Table 3.2 and visualised in Figure 3.6.</w:t>
       </w:r>
     </w:p>
     <w:tbl>
@@ -1836,6 +2106,61 @@
     </w:p>
     <w:p>
       <w:pPr>
+        <w:spacing w:before="160" w:after="40"/>
+        <w:jc w:val="center"/>
+      </w:pPr>
+      <w:r>
+        <w:drawing>
+          <wp:inline xmlns:a="http://schemas.openxmlformats.org/drawingml/2006/main" xmlns:pic="http://schemas.openxmlformats.org/drawingml/2006/picture">
+            <wp:extent cx="5852160" cy="3024943"/>
+            <wp:docPr id="6" name="Picture 6"/>
+            <wp:cNvGraphicFramePr>
+              <a:graphicFrameLocks noChangeAspect="1"/>
+            </wp:cNvGraphicFramePr>
+            <a:graphic>
+              <a:graphicData uri="http://schemas.openxmlformats.org/drawingml/2006/picture">
+                <pic:pic>
+                  <pic:nvPicPr>
+                    <pic:cNvPr id="0" name="fig_3_7_stage_dim_dist.png"/>
+                    <pic:cNvPicPr/>
+                  </pic:nvPicPr>
+                  <pic:blipFill>
+                    <a:blip r:embed="rId14"/>
+                    <a:stretch>
+                      <a:fillRect/>
+                    </a:stretch>
+                  </pic:blipFill>
+                  <pic:spPr>
+                    <a:xfrm>
+                      <a:off x="0" y="0"/>
+                      <a:ext cx="5852160" cy="3024943"/>
+                    </a:xfrm>
+                    <a:prstGeom prst="rect"/>
+                  </pic:spPr>
+                </pic:pic>
+              </a:graphicData>
+            </a:graphic>
+          </wp:inline>
+        </w:drawing>
+      </w:r>
+    </w:p>
+    <w:p>
+      <w:pPr>
+        <w:spacing w:before="40" w:after="160"/>
+        <w:jc w:val="center"/>
+      </w:pPr>
+      <w:r>
+        <w:rPr>
+          <w:rFonts w:ascii="Times New Roman" w:hAnsi="Times New Roman" w:cs="Times New Roman"/>
+          <w:b/>
+          <w:i/>
+          <w:sz w:val="22"/>
+        </w:rPr>
+        <w:t>Figure 3.6  Stage × Dimension distribution of factors: initial 144 vs final 82</w:t>
+      </w:r>
+    </w:p>
+    <w:p>
+      <w:pPr>
         <w:keepNext/>
         <w:spacing w:before="240" w:after="120"/>
         <w:jc w:val="left"/>
@@ -5586,7 +5911,62 @@
           <w:i w:val="0"/>
           <w:sz w:val="24"/>
         </w:rPr>
-        <w:t>The reduction of factors from 144 to 82 was not a single-step exercise. Three checks were carried out, in sequence, and a factor had to clear all three checks to enter the final instrument. The flow is summarised in the diagram below.</w:t>
+        <w:t>The reduction of factors from 144 to 82 was not a single-step exercise. Three checks were carried out, in sequence, and a factor had to clear all three checks to enter the final instrument. The flow is summarised in the funnel diagram below.</w:t>
+      </w:r>
+    </w:p>
+    <w:p>
+      <w:pPr>
+        <w:spacing w:before="160" w:after="40"/>
+        <w:jc w:val="center"/>
+      </w:pPr>
+      <w:r>
+        <w:drawing>
+          <wp:inline xmlns:a="http://schemas.openxmlformats.org/drawingml/2006/main" xmlns:pic="http://schemas.openxmlformats.org/drawingml/2006/picture">
+            <wp:extent cx="5852160" cy="3915424"/>
+            <wp:docPr id="7" name="Picture 7"/>
+            <wp:cNvGraphicFramePr>
+              <a:graphicFrameLocks noChangeAspect="1"/>
+            </wp:cNvGraphicFramePr>
+            <a:graphic>
+              <a:graphicData uri="http://schemas.openxmlformats.org/drawingml/2006/picture">
+                <pic:pic>
+                  <pic:nvPicPr>
+                    <pic:cNvPr id="0" name="fig_3_6_refinement_funnel.png"/>
+                    <pic:cNvPicPr/>
+                  </pic:nvPicPr>
+                  <pic:blipFill>
+                    <a:blip r:embed="rId15"/>
+                    <a:stretch>
+                      <a:fillRect/>
+                    </a:stretch>
+                  </pic:blipFill>
+                  <pic:spPr>
+                    <a:xfrm>
+                      <a:off x="0" y="0"/>
+                      <a:ext cx="5852160" cy="3915424"/>
+                    </a:xfrm>
+                    <a:prstGeom prst="rect"/>
+                  </pic:spPr>
+                </pic:pic>
+              </a:graphicData>
+            </a:graphic>
+          </wp:inline>
+        </w:drawing>
+      </w:r>
+    </w:p>
+    <w:p>
+      <w:pPr>
+        <w:spacing w:before="40" w:after="160"/>
+        <w:jc w:val="center"/>
+      </w:pPr>
+      <w:r>
+        <w:rPr>
+          <w:rFonts w:ascii="Times New Roman" w:hAnsi="Times New Roman" w:cs="Times New Roman"/>
+          <w:b/>
+          <w:i/>
+          <w:sz w:val="22"/>
+        </w:rPr>
+        <w:t>Figure 3.7  Three-step refinement funnel (144 → 116 → 94 → 82 factors)</w:t>
       </w:r>
     </w:p>
     <w:p>
@@ -5679,7 +6059,7 @@
           <w:i w:val="0"/>
           <w:sz w:val="24"/>
         </w:rPr>
-        <w:t>An inter-rater consistency check was conducted on the 94 items by sharing the item set with a smaller expert sub-panel of seven members. Cohen's kappa was computed pair-wise, and items where agreement on the dimension (cost / time / quality) fell below k = 0.60 were re-examined and either merged with a parent item or dropped. Twelve more items were removed at this stage. The instrument finally stabilised at 82 factors. Post-refinement reliability statistics from the main survey (n = 1,300) are reported in Table 3.3.</w:t>
+        <w:t>An inter-rater consistency check was conducted on the 94 items by sharing the item set with a smaller expert sub-panel of seven members. Cohen's kappa was computed pair-wise, and items where agreement on the dimension (cost / time / quality) fell below k = 0.60 were re-examined and either merged with a parent item or dropped. Twelve more items were removed at this stage. The instrument finally stabilised at 82 factors. Post-refinement reliability statistics from the main survey (n = 1,300) are reported in Table 3.3 and visualised in Figure 3.8.</w:t>
       </w:r>
     </w:p>
     <w:tbl>
@@ -7175,6 +7555,61 @@
     </w:p>
     <w:p>
       <w:pPr>
+        <w:spacing w:before="160" w:after="40"/>
+        <w:jc w:val="center"/>
+      </w:pPr>
+      <w:r>
+        <w:drawing>
+          <wp:inline xmlns:a="http://schemas.openxmlformats.org/drawingml/2006/main" xmlns:pic="http://schemas.openxmlformats.org/drawingml/2006/picture">
+            <wp:extent cx="5486400" cy="3973171"/>
+            <wp:docPr id="8" name="Picture 8"/>
+            <wp:cNvGraphicFramePr>
+              <a:graphicFrameLocks noChangeAspect="1"/>
+            </wp:cNvGraphicFramePr>
+            <a:graphic>
+              <a:graphicData uri="http://schemas.openxmlformats.org/drawingml/2006/picture">
+                <pic:pic>
+                  <pic:nvPicPr>
+                    <pic:cNvPr id="0" name="fig_3_9_cronbach.png"/>
+                    <pic:cNvPicPr/>
+                  </pic:nvPicPr>
+                  <pic:blipFill>
+                    <a:blip r:embed="rId16"/>
+                    <a:stretch>
+                      <a:fillRect/>
+                    </a:stretch>
+                  </pic:blipFill>
+                  <pic:spPr>
+                    <a:xfrm>
+                      <a:off x="0" y="0"/>
+                      <a:ext cx="5486400" cy="3973171"/>
+                    </a:xfrm>
+                    <a:prstGeom prst="rect"/>
+                  </pic:spPr>
+                </pic:pic>
+              </a:graphicData>
+            </a:graphic>
+          </wp:inline>
+        </w:drawing>
+      </w:r>
+    </w:p>
+    <w:p>
+      <w:pPr>
+        <w:spacing w:before="40" w:after="160"/>
+        <w:jc w:val="center"/>
+      </w:pPr>
+      <w:r>
+        <w:rPr>
+          <w:rFonts w:ascii="Times New Roman" w:hAnsi="Times New Roman" w:cs="Times New Roman"/>
+          <w:b/>
+          <w:i/>
+          <w:sz w:val="22"/>
+        </w:rPr>
+        <w:t>Figure 3.8  Reliability of the 15 sub-scales – Cronbach's α (n = 1,300)</w:t>
+      </w:r>
+    </w:p>
+    <w:p>
+      <w:pPr>
         <w:spacing w:line="360" w:lineRule="auto" w:after="120"/>
         <w:ind w:firstLine="425"/>
         <w:jc w:val="both"/>
@@ -8710,6 +9145,61 @@
     </w:p>
     <w:p>
       <w:pPr>
+        <w:spacing w:before="160" w:after="40"/>
+        <w:jc w:val="center"/>
+      </w:pPr>
+      <w:r>
+        <w:drawing>
+          <wp:inline xmlns:a="http://schemas.openxmlformats.org/drawingml/2006/main" xmlns:pic="http://schemas.openxmlformats.org/drawingml/2006/picture">
+            <wp:extent cx="5852160" cy="3451442"/>
+            <wp:docPr id="9" name="Picture 9"/>
+            <wp:cNvGraphicFramePr>
+              <a:graphicFrameLocks noChangeAspect="1"/>
+            </wp:cNvGraphicFramePr>
+            <a:graphic>
+              <a:graphicData uri="http://schemas.openxmlformats.org/drawingml/2006/picture">
+                <pic:pic>
+                  <pic:nvPicPr>
+                    <pic:cNvPr id="0" name="fig_3_8_sampling_tree.png"/>
+                    <pic:cNvPicPr/>
+                  </pic:nvPicPr>
+                  <pic:blipFill>
+                    <a:blip r:embed="rId17"/>
+                    <a:stretch>
+                      <a:fillRect/>
+                    </a:stretch>
+                  </pic:blipFill>
+                  <pic:spPr>
+                    <a:xfrm>
+                      <a:off x="0" y="0"/>
+                      <a:ext cx="5852160" cy="3451442"/>
+                    </a:xfrm>
+                    <a:prstGeom prst="rect"/>
+                  </pic:spPr>
+                </pic:pic>
+              </a:graphicData>
+            </a:graphic>
+          </wp:inline>
+        </w:drawing>
+      </w:r>
+    </w:p>
+    <w:p>
+      <w:pPr>
+        <w:spacing w:before="40" w:after="160"/>
+        <w:jc w:val="center"/>
+      </w:pPr>
+      <w:r>
+        <w:rPr>
+          <w:rFonts w:ascii="Times New Roman" w:hAnsi="Times New Roman" w:cs="Times New Roman"/>
+          <w:b/>
+          <w:i/>
+          <w:sz w:val="22"/>
+        </w:rPr>
+        <w:t>Figure 3.9  Stratified random sampling design (n = 1,300)</w:t>
+      </w:r>
+    </w:p>
+    <w:p>
+      <w:pPr>
         <w:keepNext/>
         <w:spacing w:before="160" w:after="80"/>
       </w:pPr>
@@ -8761,7 +9251,6 @@
         <w:spacing w:after="40" w:line="276" w:lineRule="auto"/>
         <w:ind w:left="567"/>
       </w:pPr>
-      <w:r/>
       <w:r>
         <w:rPr>
           <w:rFonts w:ascii="Times New Roman" w:hAnsi="Times New Roman" w:cs="Times New Roman"/>
@@ -8778,7 +9267,6 @@
         <w:spacing w:after="40" w:line="276" w:lineRule="auto"/>
         <w:ind w:left="567"/>
       </w:pPr>
-      <w:r/>
       <w:r>
         <w:rPr>
           <w:rFonts w:ascii="Times New Roman" w:hAnsi="Times New Roman" w:cs="Times New Roman"/>
@@ -8795,7 +9283,6 @@
         <w:spacing w:after="40" w:line="276" w:lineRule="auto"/>
         <w:ind w:left="567"/>
       </w:pPr>
-      <w:r/>
       <w:r>
         <w:rPr>
           <w:rFonts w:ascii="Times New Roman" w:hAnsi="Times New Roman" w:cs="Times New Roman"/>
@@ -8812,7 +9299,6 @@
         <w:spacing w:after="40" w:line="276" w:lineRule="auto"/>
         <w:ind w:left="567"/>
       </w:pPr>
-      <w:r/>
       <w:r>
         <w:rPr>
           <w:rFonts w:ascii="Times New Roman" w:hAnsi="Times New Roman" w:cs="Times New Roman"/>
@@ -8829,7 +9315,6 @@
         <w:spacing w:after="40" w:line="276" w:lineRule="auto"/>
         <w:ind w:left="567"/>
       </w:pPr>
-      <w:r/>
       <w:r>
         <w:rPr>
           <w:rFonts w:ascii="Times New Roman" w:hAnsi="Times New Roman" w:cs="Times New Roman"/>
@@ -8846,7 +9331,6 @@
         <w:spacing w:after="40" w:line="276" w:lineRule="auto"/>
         <w:ind w:left="567"/>
       </w:pPr>
-      <w:r/>
       <w:r>
         <w:rPr>
           <w:rFonts w:ascii="Times New Roman" w:hAnsi="Times New Roman" w:cs="Times New Roman"/>
@@ -8863,7 +9347,6 @@
         <w:spacing w:after="40" w:line="276" w:lineRule="auto"/>
         <w:ind w:left="567"/>
       </w:pPr>
-      <w:r/>
       <w:r>
         <w:rPr>
           <w:rFonts w:ascii="Times New Roman" w:hAnsi="Times New Roman" w:cs="Times New Roman"/>
@@ -8880,7 +9363,6 @@
         <w:spacing w:after="40" w:line="276" w:lineRule="auto"/>
         <w:ind w:left="567"/>
       </w:pPr>
-      <w:r/>
       <w:r>
         <w:rPr>
           <w:rFonts w:ascii="Times New Roman" w:hAnsi="Times New Roman" w:cs="Times New Roman"/>
@@ -8897,7 +9379,6 @@
         <w:spacing w:after="40" w:line="276" w:lineRule="auto"/>
         <w:ind w:left="567"/>
       </w:pPr>
-      <w:r/>
       <w:r>
         <w:rPr>
           <w:rFonts w:ascii="Times New Roman" w:hAnsi="Times New Roman" w:cs="Times New Roman"/>
@@ -9402,6 +9883,61 @@
     </w:p>
     <w:p>
       <w:pPr>
+        <w:spacing w:before="160" w:after="40"/>
+        <w:jc w:val="center"/>
+      </w:pPr>
+      <w:r>
+        <w:drawing>
+          <wp:inline xmlns:a="http://schemas.openxmlformats.org/drawingml/2006/main" xmlns:pic="http://schemas.openxmlformats.org/drawingml/2006/picture">
+            <wp:extent cx="5852160" cy="3232996"/>
+            <wp:docPr id="10" name="Picture 10"/>
+            <wp:cNvGraphicFramePr>
+              <a:graphicFrameLocks noChangeAspect="1"/>
+            </wp:cNvGraphicFramePr>
+            <a:graphic>
+              <a:graphicData uri="http://schemas.openxmlformats.org/drawingml/2006/picture">
+                <pic:pic>
+                  <pic:nvPicPr>
+                    <pic:cNvPr id="0" name="fig_3_10_analytical_pipeline.png"/>
+                    <pic:cNvPicPr/>
+                  </pic:nvPicPr>
+                  <pic:blipFill>
+                    <a:blip r:embed="rId18"/>
+                    <a:stretch>
+                      <a:fillRect/>
+                    </a:stretch>
+                  </pic:blipFill>
+                  <pic:spPr>
+                    <a:xfrm>
+                      <a:off x="0" y="0"/>
+                      <a:ext cx="5852160" cy="3232996"/>
+                    </a:xfrm>
+                    <a:prstGeom prst="rect"/>
+                  </pic:spPr>
+                </pic:pic>
+              </a:graphicData>
+            </a:graphic>
+          </wp:inline>
+        </w:drawing>
+      </w:r>
+    </w:p>
+    <w:p>
+      <w:pPr>
+        <w:spacing w:before="40" w:after="160"/>
+        <w:jc w:val="center"/>
+      </w:pPr>
+      <w:r>
+        <w:rPr>
+          <w:rFonts w:ascii="Times New Roman" w:hAnsi="Times New Roman" w:cs="Times New Roman"/>
+          <w:b/>
+          <w:i/>
+          <w:sz w:val="22"/>
+        </w:rPr>
+        <w:t>Figure 3.10  Two-stage MCDM analytical pipeline – Fuzzy AHP weights feeding into ELECTRE outranking</w:t>
+      </w:r>
+    </w:p>
+    <w:p>
+      <w:pPr>
         <w:keepNext/>
         <w:spacing w:before="240" w:after="120"/>
         <w:jc w:val="left"/>
@@ -9461,7 +9997,7 @@
           <w:i w:val="0"/>
           <w:sz w:val="24"/>
         </w:rPr>
-        <w:t>To improve the readability and visual quality of the chapter, the research design has been documented through the following supporting elements:</w:t>
+        <w:t>To improve the readability and visual quality of the chapter, the research design has been documented through the following supporting elements, which appear in their respective sections of this chapter:</w:t>
       </w:r>
     </w:p>
     <w:p>
@@ -9470,7 +10006,6 @@
         <w:spacing w:after="40" w:line="276" w:lineRule="auto"/>
         <w:ind w:left="567"/>
       </w:pPr>
-      <w:r/>
       <w:r>
         <w:rPr>
           <w:rFonts w:ascii="Times New Roman" w:hAnsi="Times New Roman" w:cs="Times New Roman"/>
@@ -9478,7 +10013,7 @@
           <w:i w:val="0"/>
           <w:sz w:val="24"/>
         </w:rPr>
-        <w:t>Flow diagrams of the overall research process (Phase I to Phase III).</w:t>
+        <w:t>Figure 3.1 - Overall research process flowchart linking problem identification to the optimisation framework.</w:t>
       </w:r>
     </w:p>
     <w:p>
@@ -9487,7 +10022,6 @@
         <w:spacing w:after="40" w:line="276" w:lineRule="auto"/>
         <w:ind w:left="567"/>
       </w:pPr>
-      <w:r/>
       <w:r>
         <w:rPr>
           <w:rFonts w:ascii="Times New Roman" w:hAnsi="Times New Roman" w:cs="Times New Roman"/>
@@ -9495,7 +10029,7 @@
           <w:i w:val="0"/>
           <w:sz w:val="24"/>
         </w:rPr>
-        <w:t>A methodology framework diagram linking Resource-Based View constructs to the cost-time-quality dimensions of the Malta chain.</w:t>
+        <w:t>Figure 3.2 - Malta supply-chain stakeholder map with achieved sample sizes.</w:t>
       </w:r>
     </w:p>
     <w:p>
@@ -9504,7 +10038,6 @@
         <w:spacing w:after="40" w:line="276" w:lineRule="auto"/>
         <w:ind w:left="567"/>
       </w:pPr>
-      <w:r/>
       <w:r>
         <w:rPr>
           <w:rFonts w:ascii="Times New Roman" w:hAnsi="Times New Roman" w:cs="Times New Roman"/>
@@ -9512,7 +10045,7 @@
           <w:i w:val="0"/>
           <w:sz w:val="24"/>
         </w:rPr>
-        <w:t>A factor screening and selection process chart (144 → 116 → 94 → 82).</w:t>
+        <w:t>Figure 3.3 - RBV framework diagram mapping resources and capabilities to the cost / time / quality dimensions of the chain.</w:t>
       </w:r>
     </w:p>
     <w:p>
@@ -9521,7 +10054,6 @@
         <w:spacing w:after="40" w:line="276" w:lineRule="auto"/>
         <w:ind w:left="567"/>
       </w:pPr>
-      <w:r/>
       <w:r>
         <w:rPr>
           <w:rFonts w:ascii="Times New Roman" w:hAnsi="Times New Roman" w:cs="Times New Roman"/>
@@ -9529,7 +10061,7 @@
           <w:i w:val="0"/>
           <w:sz w:val="24"/>
         </w:rPr>
-        <w:t>Tables for factor categorisation by stage and by dimension.</w:t>
+        <w:t>Figure 3.4 - Three-phase Gantt-style timeline of fieldwork.</w:t>
       </w:r>
     </w:p>
     <w:p>
@@ -9538,7 +10070,6 @@
         <w:spacing w:after="40" w:line="276" w:lineRule="auto"/>
         <w:ind w:left="567"/>
       </w:pPr>
-      <w:r/>
       <w:r>
         <w:rPr>
           <w:rFonts w:ascii="Times New Roman" w:hAnsi="Times New Roman" w:cs="Times New Roman"/>
@@ -9546,7 +10077,7 @@
           <w:i w:val="0"/>
           <w:sz w:val="24"/>
         </w:rPr>
-        <w:t>Stakeholder classification table showing strata and achieved sample.</w:t>
+        <w:t>Figure 3.5 - Source-convergence diagram for the initial 144-factor pool.</w:t>
       </w:r>
     </w:p>
     <w:p>
@@ -9555,7 +10086,6 @@
         <w:spacing w:after="40" w:line="276" w:lineRule="auto"/>
         <w:ind w:left="567"/>
       </w:pPr>
-      <w:r/>
       <w:r>
         <w:rPr>
           <w:rFonts w:ascii="Times New Roman" w:hAnsi="Times New Roman" w:cs="Times New Roman"/>
@@ -9563,7 +10093,7 @@
           <w:i w:val="0"/>
           <w:sz w:val="24"/>
         </w:rPr>
-        <w:t>Figures illustrating the three phases of data collection and the analytical pipeline (Fuzzy AHP weights followed by ELECTRE ranking).</w:t>
+        <w:t>Figure 3.6 - Stage × dimension factor distribution (initial vs final).</w:t>
       </w:r>
     </w:p>
     <w:p>
@@ -9572,7 +10102,6 @@
         <w:spacing w:after="40" w:line="276" w:lineRule="auto"/>
         <w:ind w:left="567"/>
       </w:pPr>
-      <w:r/>
       <w:r>
         <w:rPr>
           <w:rFonts w:ascii="Times New Roman" w:hAnsi="Times New Roman" w:cs="Times New Roman"/>
@@ -9580,7 +10109,55 @@
           <w:i w:val="0"/>
           <w:sz w:val="24"/>
         </w:rPr>
-        <w:t>Comparative graphs of Fuzzy AHP weights and ELECTRE rankings for the final 82 factors.</w:t>
+        <w:t>Figure 3.7 - Three-step refinement funnel (144 → 116 → 94 → 82).</w:t>
+      </w:r>
+    </w:p>
+    <w:p>
+      <w:pPr>
+        <w:pStyle w:val="ListBullet"/>
+        <w:spacing w:after="40" w:line="276" w:lineRule="auto"/>
+        <w:ind w:left="567"/>
+      </w:pPr>
+      <w:r>
+        <w:rPr>
+          <w:rFonts w:ascii="Times New Roman" w:hAnsi="Times New Roman" w:cs="Times New Roman"/>
+          <w:b w:val="0"/>
+          <w:i w:val="0"/>
+          <w:sz w:val="24"/>
+        </w:rPr>
+        <w:t>Figure 3.8 - Cronbach's α profile across the 15 sub-scales.</w:t>
+      </w:r>
+    </w:p>
+    <w:p>
+      <w:pPr>
+        <w:pStyle w:val="ListBullet"/>
+        <w:spacing w:after="40" w:line="276" w:lineRule="auto"/>
+        <w:ind w:left="567"/>
+      </w:pPr>
+      <w:r>
+        <w:rPr>
+          <w:rFonts w:ascii="Times New Roman" w:hAnsi="Times New Roman" w:cs="Times New Roman"/>
+          <w:b w:val="0"/>
+          <w:i w:val="0"/>
+          <w:sz w:val="24"/>
+        </w:rPr>
+        <w:t>Figure 3.9 - Stratified sampling tree showing strata and districts.</w:t>
+      </w:r>
+    </w:p>
+    <w:p>
+      <w:pPr>
+        <w:pStyle w:val="ListBullet"/>
+        <w:spacing w:after="40" w:line="276" w:lineRule="auto"/>
+        <w:ind w:left="567"/>
+      </w:pPr>
+      <w:r>
+        <w:rPr>
+          <w:rFonts w:ascii="Times New Roman" w:hAnsi="Times New Roman" w:cs="Times New Roman"/>
+          <w:b w:val="0"/>
+          <w:i w:val="0"/>
+          <w:sz w:val="24"/>
+        </w:rPr>
+        <w:t>Figure 3.10 - Two-stage MCDM analytical pipeline (Fuzzy AHP + ELECTRE).</w:t>
       </w:r>
     </w:p>
     <w:p>

</xml_diff>